<commit_message>
generics and immutable classes added
</commit_message>
<xml_diff>
--- a/Java/Basics_to_revise.docx
+++ b/Java/Basics_to_revise.docx
@@ -836,7 +836,7 @@
     <w:p>
       <w:r>
         <w:pict w14:anchorId="46362292">
-          <v:rect id="_x0000_i1109" style="width:0;height:1.5pt" o:hralign="center" o:hrstd="t" o:hr="t" fillcolor="#a0a0a0" stroked="f"/>
+          <v:rect id="_x0000_i1025" style="width:0;height:1.5pt" o:hralign="center" o:hrstd="t" o:hr="t" fillcolor="#a0a0a0" stroked="f"/>
         </w:pict>
       </w:r>
     </w:p>
@@ -1352,7 +1352,7 @@
     <w:p>
       <w:r>
         <w:pict w14:anchorId="25D906DE">
-          <v:rect id="_x0000_i1110" style="width:0;height:1.5pt" o:hralign="center" o:hrstd="t" o:hr="t" fillcolor="#a0a0a0" stroked="f"/>
+          <v:rect id="_x0000_i1026" style="width:0;height:1.5pt" o:hralign="center" o:hrstd="t" o:hr="t" fillcolor="#a0a0a0" stroked="f"/>
         </w:pict>
       </w:r>
     </w:p>
@@ -1553,7 +1553,7 @@
     <w:p>
       <w:r>
         <w:pict w14:anchorId="11E94599">
-          <v:rect id="_x0000_i1111" style="width:0;height:1.5pt" o:hralign="center" o:hrstd="t" o:hr="t" fillcolor="#a0a0a0" stroked="f"/>
+          <v:rect id="_x0000_i1027" style="width:0;height:1.5pt" o:hralign="center" o:hrstd="t" o:hr="t" fillcolor="#a0a0a0" stroked="f"/>
         </w:pict>
       </w:r>
     </w:p>
@@ -1845,7 +1845,7 @@
     <w:p>
       <w:r>
         <w:pict w14:anchorId="3D1FB4FB">
-          <v:rect id="_x0000_i1112" style="width:0;height:1.5pt" o:hralign="center" o:hrstd="t" o:hr="t" fillcolor="#a0a0a0" stroked="f"/>
+          <v:rect id="_x0000_i1028" style="width:0;height:1.5pt" o:hralign="center" o:hrstd="t" o:hr="t" fillcolor="#a0a0a0" stroked="f"/>
         </w:pict>
       </w:r>
     </w:p>
@@ -2065,7 +2065,7 @@
     <w:p>
       <w:r>
         <w:pict w14:anchorId="046ED615">
-          <v:rect id="_x0000_i1113" style="width:0;height:1.5pt" o:hralign="center" o:hrstd="t" o:hr="t" fillcolor="#a0a0a0" stroked="f"/>
+          <v:rect id="_x0000_i1029" style="width:0;height:1.5pt" o:hralign="center" o:hrstd="t" o:hr="t" fillcolor="#a0a0a0" stroked="f"/>
         </w:pict>
       </w:r>
     </w:p>
@@ -2514,7 +2514,7 @@
     <w:p>
       <w:r>
         <w:pict w14:anchorId="2B178F63">
-          <v:rect id="_x0000_i1114" style="width:0;height:1.5pt" o:hralign="center" o:hrstd="t" o:hr="t" fillcolor="#a0a0a0" stroked="f"/>
+          <v:rect id="_x0000_i1030" style="width:0;height:1.5pt" o:hralign="center" o:hrstd="t" o:hr="t" fillcolor="#a0a0a0" stroked="f"/>
         </w:pict>
       </w:r>
     </w:p>
@@ -2731,7 +2731,7 @@
     <w:p>
       <w:r>
         <w:pict w14:anchorId="41E4A5CD">
-          <v:rect id="_x0000_i1115" style="width:0;height:1.5pt" o:hralign="center" o:hrstd="t" o:hr="t" fillcolor="#a0a0a0" stroked="f"/>
+          <v:rect id="_x0000_i1031" style="width:0;height:1.5pt" o:hralign="center" o:hrstd="t" o:hr="t" fillcolor="#a0a0a0" stroked="f"/>
         </w:pict>
       </w:r>
     </w:p>
@@ -2993,7 +2993,7 @@
     <w:p>
       <w:r>
         <w:pict w14:anchorId="7BB98555">
-          <v:rect id="_x0000_i1116" style="width:0;height:1.5pt" o:hralign="center" o:hrstd="t" o:hr="t" fillcolor="#a0a0a0" stroked="f"/>
+          <v:rect id="_x0000_i1032" style="width:0;height:1.5pt" o:hralign="center" o:hrstd="t" o:hr="t" fillcolor="#a0a0a0" stroked="f"/>
         </w:pict>
       </w:r>
     </w:p>
@@ -3080,7 +3080,7 @@
     <w:p>
       <w:r>
         <w:pict w14:anchorId="173D023F">
-          <v:rect id="_x0000_i1117" style="width:0;height:1.5pt" o:hralign="center" o:hrstd="t" o:hr="t" fillcolor="#a0a0a0" stroked="f"/>
+          <v:rect id="_x0000_i1033" style="width:0;height:1.5pt" o:hralign="center" o:hrstd="t" o:hr="t" fillcolor="#a0a0a0" stroked="f"/>
         </w:pict>
       </w:r>
     </w:p>
@@ -3741,7 +3741,7 @@
     <w:p>
       <w:r>
         <w:pict w14:anchorId="1A8BE1D0">
-          <v:rect id="_x0000_i1118" style="width:0;height:1.5pt" o:hralign="center" o:hrstd="t" o:hr="t" fillcolor="#a0a0a0" stroked="f"/>
+          <v:rect id="_x0000_i1034" style="width:0;height:1.5pt" o:hralign="center" o:hrstd="t" o:hr="t" fillcolor="#a0a0a0" stroked="f"/>
         </w:pict>
       </w:r>
     </w:p>
@@ -4111,7 +4111,7 @@
     <w:p>
       <w:r>
         <w:pict w14:anchorId="0362A183">
-          <v:rect id="_x0000_i1119" style="width:0;height:1.5pt" o:hralign="center" o:hrstd="t" o:hr="t" fillcolor="#a0a0a0" stroked="f"/>
+          <v:rect id="_x0000_i1035" style="width:0;height:1.5pt" o:hralign="center" o:hrstd="t" o:hr="t" fillcolor="#a0a0a0" stroked="f"/>
         </w:pict>
       </w:r>
     </w:p>
@@ -4426,7 +4426,7 @@
     <w:p>
       <w:r>
         <w:pict w14:anchorId="79DAD3DC">
-          <v:rect id="_x0000_i1120" style="width:0;height:1.5pt" o:hralign="center" o:hrstd="t" o:hr="t" fillcolor="#a0a0a0" stroked="f"/>
+          <v:rect id="_x0000_i1036" style="width:0;height:1.5pt" o:hralign="center" o:hrstd="t" o:hr="t" fillcolor="#a0a0a0" stroked="f"/>
         </w:pict>
       </w:r>
     </w:p>
@@ -4650,7 +4650,7 @@
     <w:p>
       <w:r>
         <w:pict w14:anchorId="5AFEA4BE">
-          <v:rect id="_x0000_i1121" style="width:0;height:1.5pt" o:hralign="center" o:hrstd="t" o:hr="t" fillcolor="#a0a0a0" stroked="f"/>
+          <v:rect id="_x0000_i1037" style="width:0;height:1.5pt" o:hralign="center" o:hrstd="t" o:hr="t" fillcolor="#a0a0a0" stroked="f"/>
         </w:pict>
       </w:r>
     </w:p>
@@ -4836,297 +4836,302 @@
     <w:p>
       <w:r>
         <w:pict w14:anchorId="7602F6BF">
-          <v:rect id="_x0000_i1122" style="width:0;height:1.5pt" o:hralign="center" o:hrstd="t" o:hr="t" fillcolor="#a0a0a0" stroked="f"/>
+          <v:rect id="_x0000_i1038" style="width:0;height:1.5pt" o:hralign="center" o:hrstd="t" o:hr="t" fillcolor="#a0a0a0" stroked="f"/>
         </w:pict>
       </w:r>
     </w:p>
     <w:p>
       <w:pPr>
         <w:rPr>
-          <w:b/>
-          <w:bCs/>
-        </w:rPr>
-      </w:pPr>
-      <w:r>
-        <w:rPr>
-          <w:b/>
-          <w:bCs/>
-        </w:rPr>
-        <w:t>15. Messaging</w:t>
-      </w:r>
-    </w:p>
-    <w:p>
-      <w:r>
-        <w:t>Since you already know RabbitMQ, learn the Spring ecosystem around it.</w:t>
-      </w:r>
-    </w:p>
-    <w:p>
-      <w:pPr>
-        <w:rPr>
-          <w:b/>
-          <w:bCs/>
-        </w:rPr>
-      </w:pPr>
-      <w:r>
-        <w:rPr>
-          <w:b/>
-          <w:bCs/>
-        </w:rPr>
-        <w:t>RabbitMQ</w:t>
-      </w:r>
-    </w:p>
-    <w:p>
-      <w:pPr>
-        <w:numPr>
-          <w:ilvl w:val="0"/>
-          <w:numId w:val="27"/>
-        </w:numPr>
-      </w:pPr>
-      <w:r>
-        <w:t xml:space="preserve">Producer </w:t>
-      </w:r>
-    </w:p>
-    <w:p>
-      <w:pPr>
-        <w:numPr>
-          <w:ilvl w:val="0"/>
-          <w:numId w:val="27"/>
-        </w:numPr>
-      </w:pPr>
-      <w:r>
-        <w:t xml:space="preserve">Consumer </w:t>
-      </w:r>
-    </w:p>
-    <w:p>
-      <w:pPr>
-        <w:numPr>
-          <w:ilvl w:val="0"/>
-          <w:numId w:val="27"/>
-        </w:numPr>
-      </w:pPr>
-      <w:r>
-        <w:t xml:space="preserve">Exchange </w:t>
-      </w:r>
-    </w:p>
-    <w:p>
-      <w:pPr>
-        <w:numPr>
-          <w:ilvl w:val="0"/>
-          <w:numId w:val="27"/>
-        </w:numPr>
-      </w:pPr>
-      <w:r>
-        <w:t xml:space="preserve">Queue </w:t>
-      </w:r>
-    </w:p>
-    <w:p>
-      <w:pPr>
-        <w:numPr>
-          <w:ilvl w:val="0"/>
-          <w:numId w:val="27"/>
-        </w:numPr>
-      </w:pPr>
-      <w:r>
-        <w:t xml:space="preserve">Routing key </w:t>
-      </w:r>
-    </w:p>
-    <w:p>
-      <w:pPr>
-        <w:numPr>
-          <w:ilvl w:val="0"/>
-          <w:numId w:val="27"/>
-        </w:numPr>
-      </w:pPr>
-      <w:r>
-        <w:t xml:space="preserve">Binding </w:t>
-      </w:r>
-    </w:p>
-    <w:p>
-      <w:pPr>
-        <w:numPr>
-          <w:ilvl w:val="0"/>
-          <w:numId w:val="27"/>
-        </w:numPr>
-      </w:pPr>
-      <w:r>
-        <w:t xml:space="preserve">Ack </w:t>
-      </w:r>
-    </w:p>
-    <w:p>
-      <w:pPr>
-        <w:numPr>
-          <w:ilvl w:val="0"/>
-          <w:numId w:val="27"/>
-        </w:numPr>
-      </w:pPr>
-      <w:r>
-        <w:t xml:space="preserve">Retry </w:t>
-      </w:r>
-    </w:p>
-    <w:p>
-      <w:pPr>
-        <w:numPr>
-          <w:ilvl w:val="0"/>
-          <w:numId w:val="27"/>
-        </w:numPr>
-      </w:pPr>
-      <w:r>
-        <w:t xml:space="preserve">Dead-letter queue </w:t>
-      </w:r>
-    </w:p>
-    <w:p>
-      <w:pPr>
-        <w:numPr>
-          <w:ilvl w:val="0"/>
-          <w:numId w:val="27"/>
-        </w:numPr>
-      </w:pPr>
-      <w:r>
-        <w:t xml:space="preserve">Idempotency </w:t>
-      </w:r>
-    </w:p>
-    <w:p>
-      <w:pPr>
-        <w:rPr>
-          <w:b/>
-          <w:bCs/>
-        </w:rPr>
-      </w:pPr>
-      <w:r>
-        <w:rPr>
-          <w:b/>
-          <w:bCs/>
-        </w:rPr>
-        <w:t>Kafka</w:t>
-      </w:r>
-    </w:p>
-    <w:p>
-      <w:r>
-        <w:t>For your target level, know:</w:t>
-      </w:r>
-    </w:p>
-    <w:p>
-      <w:pPr>
-        <w:numPr>
-          <w:ilvl w:val="0"/>
-          <w:numId w:val="28"/>
-        </w:numPr>
-      </w:pPr>
-      <w:r>
-        <w:t xml:space="preserve">Topic </w:t>
-      </w:r>
-    </w:p>
-    <w:p>
-      <w:pPr>
-        <w:numPr>
-          <w:ilvl w:val="0"/>
-          <w:numId w:val="28"/>
-        </w:numPr>
-      </w:pPr>
-      <w:r>
-        <w:t xml:space="preserve">Partition </w:t>
-      </w:r>
-    </w:p>
-    <w:p>
-      <w:pPr>
-        <w:numPr>
-          <w:ilvl w:val="0"/>
-          <w:numId w:val="28"/>
-        </w:numPr>
-      </w:pPr>
-      <w:r>
-        <w:t xml:space="preserve">Offset </w:t>
-      </w:r>
-    </w:p>
-    <w:p>
-      <w:pPr>
-        <w:numPr>
-          <w:ilvl w:val="0"/>
-          <w:numId w:val="28"/>
-        </w:numPr>
-      </w:pPr>
-      <w:r>
-        <w:t xml:space="preserve">Consumer group </w:t>
-      </w:r>
-    </w:p>
-    <w:p>
-      <w:pPr>
-        <w:numPr>
-          <w:ilvl w:val="0"/>
-          <w:numId w:val="28"/>
-        </w:numPr>
-      </w:pPr>
-      <w:r>
-        <w:t xml:space="preserve">Producer </w:t>
-      </w:r>
-    </w:p>
-    <w:p>
-      <w:pPr>
-        <w:numPr>
-          <w:ilvl w:val="0"/>
-          <w:numId w:val="28"/>
-        </w:numPr>
-      </w:pPr>
-      <w:r>
-        <w:t xml:space="preserve">Consumer </w:t>
-      </w:r>
-    </w:p>
-    <w:p>
-      <w:pPr>
-        <w:numPr>
-          <w:ilvl w:val="0"/>
-          <w:numId w:val="28"/>
-        </w:numPr>
-      </w:pPr>
-      <w:r>
-        <w:t xml:space="preserve">Ordering </w:t>
-      </w:r>
-    </w:p>
-    <w:p>
-      <w:pPr>
-        <w:numPr>
-          <w:ilvl w:val="0"/>
-          <w:numId w:val="28"/>
-        </w:numPr>
-      </w:pPr>
-      <w:r>
-        <w:t xml:space="preserve">Replication </w:t>
-      </w:r>
-    </w:p>
-    <w:p>
-      <w:pPr>
-        <w:numPr>
-          <w:ilvl w:val="0"/>
-          <w:numId w:val="28"/>
-        </w:numPr>
-      </w:pPr>
-      <w:r>
-        <w:t xml:space="preserve">Delivery semantics </w:t>
-      </w:r>
-    </w:p>
-    <w:p>
-      <w:pPr>
-        <w:numPr>
-          <w:ilvl w:val="0"/>
-          <w:numId w:val="28"/>
-        </w:numPr>
-      </w:pPr>
-      <w:r>
-        <w:t xml:space="preserve">Retry/DLQ </w:t>
-      </w:r>
-    </w:p>
-    <w:p>
-      <w:pPr>
-        <w:numPr>
-          <w:ilvl w:val="0"/>
-          <w:numId w:val="28"/>
-        </w:numPr>
-      </w:pPr>
-      <w:r>
-        <w:t>Idempotent consumers</w:t>
-      </w:r>
-    </w:p>
-    <w:p/>
+          <w:rFonts w:ascii="Consolas" w:hAnsi="Consolas"/>
+          <w:sz w:val="16"/>
+          <w:szCs w:val="16"/>
+        </w:rPr>
+      </w:pPr>
+      <w:r>
+        <w:rPr>
+          <w:rFonts w:ascii="Consolas" w:hAnsi="Consolas"/>
+          <w:sz w:val="16"/>
+          <w:szCs w:val="16"/>
+        </w:rPr>
+        <w:t>1. IoC + DI</w:t>
+      </w:r>
+    </w:p>
+    <w:p>
+      <w:pPr>
+        <w:rPr>
+          <w:rFonts w:ascii="Consolas" w:hAnsi="Consolas"/>
+          <w:sz w:val="16"/>
+          <w:szCs w:val="16"/>
+        </w:rPr>
+      </w:pPr>
+      <w:r>
+        <w:rPr>
+          <w:rFonts w:ascii="Consolas" w:hAnsi="Consolas"/>
+          <w:sz w:val="16"/>
+          <w:szCs w:val="16"/>
+        </w:rPr>
+        <w:t xml:space="preserve">       ↓</w:t>
+      </w:r>
+    </w:p>
+    <w:p>
+      <w:pPr>
+        <w:rPr>
+          <w:rFonts w:ascii="Consolas" w:hAnsi="Consolas"/>
+          <w:sz w:val="16"/>
+          <w:szCs w:val="16"/>
+        </w:rPr>
+      </w:pPr>
+      <w:r>
+        <w:rPr>
+          <w:rFonts w:ascii="Consolas" w:hAnsi="Consolas"/>
+          <w:sz w:val="16"/>
+          <w:szCs w:val="16"/>
+        </w:rPr>
+        <w:t xml:space="preserve">2. Beans + </w:t>
+      </w:r>
+      <w:proofErr w:type="spellStart"/>
+      <w:r>
+        <w:rPr>
+          <w:rFonts w:ascii="Consolas" w:hAnsi="Consolas"/>
+          <w:sz w:val="16"/>
+          <w:szCs w:val="16"/>
+        </w:rPr>
+        <w:t>ApplicationContext</w:t>
+      </w:r>
+      <w:proofErr w:type="spellEnd"/>
+    </w:p>
+    <w:p>
+      <w:pPr>
+        <w:rPr>
+          <w:rFonts w:ascii="Consolas" w:hAnsi="Consolas"/>
+          <w:sz w:val="16"/>
+          <w:szCs w:val="16"/>
+        </w:rPr>
+      </w:pPr>
+      <w:r>
+        <w:rPr>
+          <w:rFonts w:ascii="Consolas" w:hAnsi="Consolas"/>
+          <w:sz w:val="16"/>
+          <w:szCs w:val="16"/>
+        </w:rPr>
+        <w:t xml:space="preserve">       ↓</w:t>
+      </w:r>
+    </w:p>
+    <w:p>
+      <w:pPr>
+        <w:rPr>
+          <w:rFonts w:ascii="Consolas" w:hAnsi="Consolas"/>
+          <w:sz w:val="16"/>
+          <w:szCs w:val="16"/>
+        </w:rPr>
+      </w:pPr>
+      <w:r>
+        <w:rPr>
+          <w:rFonts w:ascii="Consolas" w:hAnsi="Consolas"/>
+          <w:sz w:val="16"/>
+          <w:szCs w:val="16"/>
+        </w:rPr>
+        <w:t>3. @Configuration + @Bean</w:t>
+      </w:r>
+    </w:p>
+    <w:p>
+      <w:pPr>
+        <w:rPr>
+          <w:rFonts w:ascii="Consolas" w:hAnsi="Consolas"/>
+          <w:sz w:val="16"/>
+          <w:szCs w:val="16"/>
+        </w:rPr>
+      </w:pPr>
+      <w:r>
+        <w:rPr>
+          <w:rFonts w:ascii="Consolas" w:hAnsi="Consolas"/>
+          <w:sz w:val="16"/>
+          <w:szCs w:val="16"/>
+        </w:rPr>
+        <w:t xml:space="preserve">       ↓</w:t>
+      </w:r>
+    </w:p>
+    <w:p>
+      <w:pPr>
+        <w:rPr>
+          <w:rFonts w:ascii="Consolas" w:hAnsi="Consolas"/>
+          <w:sz w:val="16"/>
+          <w:szCs w:val="16"/>
+        </w:rPr>
+      </w:pPr>
+      <w:r>
+        <w:rPr>
+          <w:rFonts w:ascii="Consolas" w:hAnsi="Consolas"/>
+          <w:sz w:val="16"/>
+          <w:szCs w:val="16"/>
+        </w:rPr>
+        <w:t>4. Bean scopes + lifecycle</w:t>
+      </w:r>
+    </w:p>
+    <w:p>
+      <w:pPr>
+        <w:rPr>
+          <w:rFonts w:ascii="Consolas" w:hAnsi="Consolas"/>
+          <w:sz w:val="16"/>
+          <w:szCs w:val="16"/>
+        </w:rPr>
+      </w:pPr>
+      <w:r>
+        <w:rPr>
+          <w:rFonts w:ascii="Consolas" w:hAnsi="Consolas"/>
+          <w:sz w:val="16"/>
+          <w:szCs w:val="16"/>
+        </w:rPr>
+        <w:t xml:space="preserve">       ↓</w:t>
+      </w:r>
+    </w:p>
+    <w:p>
+      <w:pPr>
+        <w:rPr>
+          <w:rFonts w:ascii="Consolas" w:hAnsi="Consolas"/>
+          <w:sz w:val="16"/>
+          <w:szCs w:val="16"/>
+        </w:rPr>
+      </w:pPr>
+      <w:r>
+        <w:rPr>
+          <w:rFonts w:ascii="Consolas" w:hAnsi="Consolas"/>
+          <w:sz w:val="16"/>
+          <w:szCs w:val="16"/>
+        </w:rPr>
+        <w:t>5. AOP + proxies</w:t>
+      </w:r>
+    </w:p>
+    <w:p>
+      <w:pPr>
+        <w:rPr>
+          <w:rFonts w:ascii="Consolas" w:hAnsi="Consolas"/>
+          <w:sz w:val="16"/>
+          <w:szCs w:val="16"/>
+        </w:rPr>
+      </w:pPr>
+      <w:r>
+        <w:rPr>
+          <w:rFonts w:ascii="Consolas" w:hAnsi="Consolas"/>
+          <w:sz w:val="16"/>
+          <w:szCs w:val="16"/>
+        </w:rPr>
+        <w:t xml:space="preserve">       ↓</w:t>
+      </w:r>
+    </w:p>
+    <w:p>
+      <w:pPr>
+        <w:rPr>
+          <w:rFonts w:ascii="Consolas" w:hAnsi="Consolas"/>
+          <w:sz w:val="16"/>
+          <w:szCs w:val="16"/>
+        </w:rPr>
+      </w:pPr>
+      <w:r>
+        <w:rPr>
+          <w:rFonts w:ascii="Consolas" w:hAnsi="Consolas"/>
+          <w:sz w:val="16"/>
+          <w:szCs w:val="16"/>
+        </w:rPr>
+        <w:t xml:space="preserve">6. Spring MVC + </w:t>
+      </w:r>
+      <w:proofErr w:type="spellStart"/>
+      <w:r>
+        <w:rPr>
+          <w:rFonts w:ascii="Consolas" w:hAnsi="Consolas"/>
+          <w:sz w:val="16"/>
+          <w:szCs w:val="16"/>
+        </w:rPr>
+        <w:t>DispatcherServlet</w:t>
+      </w:r>
+      <w:proofErr w:type="spellEnd"/>
+    </w:p>
+    <w:p>
+      <w:pPr>
+        <w:rPr>
+          <w:rFonts w:ascii="Consolas" w:hAnsi="Consolas"/>
+          <w:sz w:val="16"/>
+          <w:szCs w:val="16"/>
+        </w:rPr>
+      </w:pPr>
+      <w:r>
+        <w:rPr>
+          <w:rFonts w:ascii="Consolas" w:hAnsi="Consolas"/>
+          <w:sz w:val="16"/>
+          <w:szCs w:val="16"/>
+        </w:rPr>
+        <w:t xml:space="preserve">       ↓</w:t>
+      </w:r>
+    </w:p>
+    <w:p>
+      <w:pPr>
+        <w:rPr>
+          <w:rFonts w:ascii="Consolas" w:hAnsi="Consolas"/>
+          <w:sz w:val="16"/>
+          <w:szCs w:val="16"/>
+        </w:rPr>
+      </w:pPr>
+      <w:r>
+        <w:rPr>
+          <w:rFonts w:ascii="Consolas" w:hAnsi="Consolas"/>
+          <w:sz w:val="16"/>
+          <w:szCs w:val="16"/>
+        </w:rPr>
+        <w:t>7. Transactions</w:t>
+      </w:r>
+    </w:p>
+    <w:p>
+      <w:pPr>
+        <w:rPr>
+          <w:rFonts w:ascii="Consolas" w:hAnsi="Consolas"/>
+          <w:sz w:val="16"/>
+          <w:szCs w:val="16"/>
+        </w:rPr>
+      </w:pPr>
+      <w:r>
+        <w:rPr>
+          <w:rFonts w:ascii="Consolas" w:hAnsi="Consolas"/>
+          <w:sz w:val="16"/>
+          <w:szCs w:val="16"/>
+        </w:rPr>
+        <w:t xml:space="preserve">       ↓</w:t>
+      </w:r>
+    </w:p>
+    <w:p>
+      <w:pPr>
+        <w:rPr>
+          <w:rFonts w:ascii="Consolas" w:hAnsi="Consolas"/>
+          <w:sz w:val="16"/>
+          <w:szCs w:val="16"/>
+        </w:rPr>
+      </w:pPr>
+      <w:r>
+        <w:rPr>
+          <w:rFonts w:ascii="Consolas" w:hAnsi="Consolas"/>
+          <w:sz w:val="16"/>
+          <w:szCs w:val="16"/>
+        </w:rPr>
+        <w:t xml:space="preserve">        ↓</w:t>
+      </w:r>
+    </w:p>
+    <w:p>
+      <w:pPr>
+        <w:rPr>
+          <w:rFonts w:ascii="Consolas" w:hAnsi="Consolas"/>
+          <w:sz w:val="16"/>
+          <w:szCs w:val="16"/>
+        </w:rPr>
+      </w:pPr>
+      <w:r>
+        <w:rPr>
+          <w:rFonts w:ascii="Consolas" w:hAnsi="Consolas"/>
+          <w:sz w:val="16"/>
+          <w:szCs w:val="16"/>
+        </w:rPr>
+        <w:t>Spring Boot suddenly makes much more sense</w:t>
+      </w:r>
+    </w:p>
     <w:sectPr>
       <w:pgSz w:w="16838" w:h="23811" w:code="8"/>
       <w:pgMar w:top="288" w:right="288" w:bottom="288" w:left="288" w:header="720" w:footer="720" w:gutter="0"/>
@@ -10001,6 +10006,7 @@
   <w:style w:type="character" w:default="1" w:styleId="DefaultParagraphFont">
     <w:name w:val="Default Paragraph Font"/>
     <w:uiPriority w:val="1"/>
+    <w:semiHidden/>
     <w:unhideWhenUsed/>
   </w:style>
   <w:style w:type="table" w:default="1" w:styleId="TableNormal">

</xml_diff>